<commit_message>
Actualisation des livrables de la session
</commit_message>
<xml_diff>
--- a/livrables-IGPDE-2026-102846/Livrables-Formateur/documents-administratifs-igpde/102846FiCat-v2.docx
+++ b/livrables-IGPDE-2026-102846/Livrables-Formateur/documents-administratifs-igpde/102846FiCat-v2.docx
@@ -233,7 +233,7 @@
         </w:numPr>
       </w:pPr>
       <w:r>
-        <w:t>Évaluer la conformité d’un contenu numérique aux exigences légales d’accessibilité.</w:t>
+        <w:t>Repérer des écarts d’accessibilité observables dans un document ou une page web et distinguer un contrôle rapide d’un audit complet de conformité.</w:t>
       </w:r>
     </w:p>
     <w:p>
@@ -352,7 +352,7 @@
         <w:pStyle w:val="FirstParagraph"/>
       </w:pPr>
       <w:r>
-        <w:t>Cette formation allie apports théoriques et exercices pratiques avec création de documents, correction d’erreurs et tests avec lecteur d’écran pour une montée en compétences progressive. Auto-évaluation du niveau des compétences en début et fin de formation permettant de mesurer la progression. Tour de table et questionnaire individuel de satisfaction. L’attestation de présence sera envoyée aux stagiaires sur demande auprès de votre chargé(e) de formation.</w:t>
+        <w:t>Cette formation allie apports théoriques et exercices pratiques avec création de documents, correction d’erreurs et tests avec lecteur d’écran pour une montée en compétences progressive. Un auto-positionnement oral sur les mêmes compétences au début et à la fin de la formation permet de mesurer la progression. Tour de table et questionnaire individuel de satisfaction. L’attestation de présence sera envoyée aux stagiaires sur demande auprès de votre chargé(e) de formation.</w:t>
       </w:r>
       <w:bookmarkEnd w:id="0"/>
       <w:bookmarkEnd w:id="7"/>

</xml_diff>